<commit_message>
actrualizacion de graphify y errores de [ERR-11] Inconsistencias de alcance y catálogos entre documentos
</commit_message>
<xml_diff>
--- a/Fase 2/Evidencias Proyecto/Evidencias de documentación/1.1 Lean Canvas/Vision del Producto.docx
+++ b/Fase 2/Evidencias Proyecto/Evidencias de documentación/1.1 Lean Canvas/Vision del Producto.docx
@@ -753,7 +753,7 @@
         <w:rPr>
           <w:rtl w:val="0"/>
         </w:rPr>
-        <w:t xml:space="preserve">El proyecto “Emergen” busca entregar una solución rápida a las situaciones que requieran un llamado de emergencia ágil y efectivo (sean incidentes médicos, domésticos y/o accidentes urbanos). Su objetivo es comunicar a los contactos de emergencia del usuario y a los servicios de emergencia comunes (ambulancias o fuerzas de orden) toda la información necesaria para acudir en su auxilio en el momento en que se utilice la aplicación (información médica relevante, contexto del accidente y ubicación del incidente).</w:t>
+        <w:t xml:space="preserve">El proyecto “Emergen” busca entregar una solución rápida a las situaciones que requieran un llamado de emergencia ágil y efectivo (sean incidentes médicos, domésticos y/o accidentes urbanos). Su objetivo es comunicar a los contactos de emergencia del usuario toda la información necesaria para acudir en su auxilio en el momento en que se utilice la aplicación (información médica relevante, contexto del accidente y ubicación del incidente), y mostrar los números oficiales de emergencia (131, 132 y 133).</w:t>
       </w:r>
     </w:p>
     <w:p>
@@ -778,7 +778,7 @@
         <w:rPr>
           <w:rtl w:val="0"/>
         </w:rPr>
-        <w:t xml:space="preserve">“Emergen” busca solucionar los tiempos de espera en situaciones de emergencia, brindando una comunicación efectiva al círculo cercano de la persona y a los agentes de seguridad para el auxilio del usuario.</w:t>
+        <w:t xml:space="preserve">“Emergen” busca solucionar los tiempos de espera en situaciones de emergencia, brindando una comunicación efectiva al círculo cercano de la persona para el auxilio del usuario.</w:t>
       </w:r>
     </w:p>
     <w:p>

</xml_diff>